<commit_message>
AWS S3 skill added
</commit_message>
<xml_diff>
--- a/files/CV_React_Developer_Lukhanin_Mar2026.docx
+++ b/files/CV_React_Developer_Lukhanin_Mar2026.docx
@@ -2591,7 +2591,7 @@
           <w:szCs w:val="20"/>
           <w:lang w:val="en-US"/>
         </w:rPr>
-        <w:t xml:space="preserve"> for large-scale data processing, improving frontend-backend integration with </w:t>
+        <w:t xml:space="preserve"> for large-scale data processing, improving system latency using </w:t>
       </w:r>
       <w:r>
         <w:rPr>
@@ -2602,17 +2602,17 @@
           <w:szCs w:val="20"/>
           <w:lang w:val="en-US"/>
         </w:rPr>
-        <w:t>MS SQL Server</w:t>
-      </w:r>
-      <w:r>
-        <w:rPr>
-          <w:rFonts w:ascii="Open Sans Light" w:hAnsi="Open Sans Light" w:cs="Open Sans Light"/>
-          <w:noProof/>
-          <w:sz w:val="20"/>
-          <w:szCs w:val="20"/>
-          <w:lang w:val="en-US"/>
-        </w:rPr>
-        <w:t xml:space="preserve"> via </w:t>
+        <w:t>Redis</w:t>
+      </w:r>
+      <w:r>
+        <w:rPr>
+          <w:rFonts w:ascii="Open Sans Light" w:hAnsi="Open Sans Light" w:cs="Open Sans Light"/>
+          <w:noProof/>
+          <w:sz w:val="20"/>
+          <w:szCs w:val="20"/>
+          <w:lang w:val="en-US"/>
+        </w:rPr>
+        <w:t xml:space="preserve"> caching and </w:t>
       </w:r>
       <w:r>
         <w:rPr>
@@ -2623,6 +2623,27 @@
           <w:szCs w:val="20"/>
           <w:lang w:val="en-US"/>
         </w:rPr>
+        <w:t>SQL</w:t>
+      </w:r>
+      <w:r>
+        <w:rPr>
+          <w:rFonts w:ascii="Open Sans Light" w:hAnsi="Open Sans Light" w:cs="Open Sans Light"/>
+          <w:noProof/>
+          <w:sz w:val="20"/>
+          <w:szCs w:val="20"/>
+          <w:lang w:val="en-US"/>
+        </w:rPr>
+        <w:t xml:space="preserve"> query optimization via </w:t>
+      </w:r>
+      <w:r>
+        <w:rPr>
+          <w:rFonts w:ascii="Open Sans Light" w:hAnsi="Open Sans Light" w:cs="Open Sans Light"/>
+          <w:b/>
+          <w:noProof/>
+          <w:sz w:val="20"/>
+          <w:szCs w:val="20"/>
+          <w:lang w:val="en-US"/>
+        </w:rPr>
         <w:t>Entity Framework Core</w:t>
       </w:r>
       <w:r>
@@ -2633,7 +2654,38 @@
           <w:szCs w:val="20"/>
           <w:lang w:val="en-US"/>
         </w:rPr>
-        <w:t xml:space="preserve"> and query optimization.</w:t>
+        <w:t xml:space="preserve">, </w:t>
+      </w:r>
+      <w:r>
+        <w:rPr>
+          <w:rFonts w:ascii="Open Sans Light" w:hAnsi="Open Sans Light" w:cs="Open Sans Light"/>
+          <w:noProof/>
+          <w:sz w:val="20"/>
+          <w:szCs w:val="20"/>
+          <w:lang w:val="en-US"/>
+        </w:rPr>
+        <w:t xml:space="preserve">integrating </w:t>
+      </w:r>
+      <w:r>
+        <w:rPr>
+          <w:rFonts w:ascii="Open Sans Light" w:hAnsi="Open Sans Light" w:cs="Open Sans Light"/>
+          <w:b/>
+          <w:noProof/>
+          <w:sz w:val="20"/>
+          <w:szCs w:val="20"/>
+          <w:lang w:val="en-US"/>
+        </w:rPr>
+        <w:t>AWS S3</w:t>
+      </w:r>
+      <w:r>
+        <w:rPr>
+          <w:rFonts w:ascii="Open Sans Light" w:hAnsi="Open Sans Light" w:cs="Open Sans Light"/>
+          <w:noProof/>
+          <w:sz w:val="20"/>
+          <w:szCs w:val="20"/>
+          <w:lang w:val="en-US"/>
+        </w:rPr>
+        <w:t xml:space="preserve"> for secure object storage</w:t>
       </w:r>
     </w:p>
     <w:p>
@@ -4047,8 +4099,32 @@
           <w:szCs w:val="20"/>
           <w:lang w:val="en-US"/>
         </w:rPr>
-        <w:t>: MS SQL Server (SSMS), Redis</w:t>
-      </w:r>
+        <w:t>: MS SQL Server (SSMS),</w:t>
+      </w:r>
+      <w:r>
+        <w:rPr>
+          <w:rFonts w:ascii="Open Sans Light" w:hAnsi="Open Sans Light" w:cs="Open Sans Light"/>
+          <w:noProof/>
+          <w:color w:val="000000" w:themeColor="text1"/>
+          <w:sz w:val="20"/>
+          <w:szCs w:val="20"/>
+          <w:lang w:val="en-US"/>
+        </w:rPr>
+        <w:t xml:space="preserve"> AWS S3,</w:t>
+      </w:r>
+      <w:r>
+        <w:rPr>
+          <w:rFonts w:ascii="Open Sans Light" w:hAnsi="Open Sans Light" w:cs="Open Sans Light"/>
+          <w:noProof/>
+          <w:color w:val="000000" w:themeColor="text1"/>
+          <w:sz w:val="20"/>
+          <w:szCs w:val="20"/>
+          <w:lang w:val="en-US"/>
+        </w:rPr>
+        <w:t xml:space="preserve"> Redis</w:t>
+      </w:r>
+      <w:bookmarkStart w:id="0" w:name="_GoBack"/>
+      <w:bookmarkEnd w:id="0"/>
     </w:p>
     <w:p>
       <w:pPr>
@@ -4516,8 +4592,6 @@
         </w:rPr>
         <w:t>Strategic Planning</w:t>
       </w:r>
-      <w:bookmarkStart w:id="0" w:name="_GoBack"/>
-      <w:bookmarkEnd w:id="0"/>
     </w:p>
     <w:p>
       <w:pPr>
@@ -5614,7 +5688,7 @@
                               <w:szCs w:val="16"/>
                               <w:lang w:val="en-US"/>
                             </w:rPr>
-                            <w:t>17 March 2026</w:t>
+                            <w:t>27 March 2026</w:t>
                           </w:r>
                           <w:r>
                             <w:rPr>
@@ -5714,7 +5788,7 @@
                         <w:szCs w:val="16"/>
                         <w:lang w:val="en-US"/>
                       </w:rPr>
-                      <w:t>17 March 2026</w:t>
+                      <w:t>27 March 2026</w:t>
                     </w:r>
                     <w:r>
                       <w:rPr>
@@ -5942,14 +6016,14 @@
         <v:path o:extrusionok="f" gradientshapeok="t" o:connecttype="rect"/>
         <o:lock v:ext="edit" aspectratio="t"/>
       </v:shapetype>
-      <v:shape id="_x0000_i1150" type="#_x0000_t75" style="width:13.3pt;height:13.3pt;visibility:visible" o:gfxdata="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" o:bullet="t">
+      <v:shape id="_x0000_i1030" type="#_x0000_t75" style="width:13.15pt;height:13.15pt;visibility:visible" o:gfxdata="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" o:bullet="t">
         <v:imagedata r:id="rId1" o:title="" cropbottom="-1179f" cropright="-1179f"/>
       </v:shape>
     </w:pict>
   </w:numPicBullet>
   <w:numPicBullet w:numPicBulletId="1">
     <w:pict>
-      <v:shape id="_x0000_i1151" type="#_x0000_t75" style="width:19.15pt;height:17.05pt;visibility:visible" o:gfxdata="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" o:bullet="t">
+      <v:shape id="_x0000_i1031" type="#_x0000_t75" style="width:19.4pt;height:16.9pt;visibility:visible" o:gfxdata="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" o:bullet="t">
         <v:imagedata r:id="rId2" o:title="" cropbottom="-780f"/>
       </v:shape>
     </w:pict>

</xml_diff>